<commit_message>
docs: update Week01 and Week02 files
</commit_message>
<xml_diff>
--- a/documentation/CSE4204-8D-T01_Proposal.docx
+++ b/documentation/CSE4204-8D-T01_Proposal.docx
@@ -27,7 +27,14 @@
           <w:sz w:val="28"/>
         </w:rPr>
         <w:br/>
-        <w:t>Semester: Fall 2025</w:t>
+        <w:t>Semester: Fall 202</w:t>
+      </w:r>
+      <w:r>
+        <w:rPr>
+          <w:b/>
+          <w:sz w:val="28"/>
+        </w:rPr>
+        <w:t>6</w:t>
       </w:r>
     </w:p>
     <w:p>
@@ -130,7 +137,7 @@
           </w:tcPr>
           <w:p>
             <w:r>
-              <w:t>Team Leader. Django backend, Celery automation, OpenRouter API, ML models, System architecture.</w:t>
+              <w:t>Django backend, Celery automation, OpenRouter API, ML models, System architecture.</w:t>
             </w:r>
           </w:p>
         </w:tc>
@@ -251,7 +258,10 @@
         <w:t xml:space="preserve">Section: </w:t>
       </w:r>
       <w:r>
-        <w:t>8A</w:t>
+        <w:t>8</w:t>
+      </w:r>
+      <w:r>
+        <w:t>D</w:t>
       </w:r>
       <w:r>
         <w:rPr>
@@ -263,7 +273,7 @@
         <w:t>CSE4204-8</w:t>
       </w:r>
       <w:r>
-        <w:t>A</w:t>
+        <w:t>D</w:t>
       </w:r>
       <w:r>
         <w:t>-T01</w:t>
@@ -696,7 +706,7 @@
         <w:t xml:space="preserve">GitHub Repository: </w:t>
       </w:r>
       <w:r>
-        <w:t>https://github.com/bashiralam963/CSE4204-8A-T01-nubtk-copilot</w:t>
+        <w:t>https://github.com/bashirnubtk/cse4204-8d-t01-nubtk-copilot</w:t>
       </w:r>
     </w:p>
     <w:sectPr>

</xml_diff>

<commit_message>
docs: condense proposal to two pages by trimming features and tech stack tables
</commit_message>
<xml_diff>
--- a/documentation/CSE4204-8D-T01_Proposal.docx
+++ b/documentation/CSE4204-8D-T01_Proposal.docx
@@ -137,7 +137,15 @@
           </w:tcPr>
           <w:p>
             <w:r>
-              <w:t>Django backend, Celery automation, OpenRouter API, ML models, System architecture.</w:t>
+              <w:t xml:space="preserve">Django backend, Celery automation, </w:t>
+            </w:r>
+            <w:proofErr w:type="spellStart"/>
+            <w:r>
+              <w:t>OpenRouter</w:t>
+            </w:r>
+            <w:proofErr w:type="spellEnd"/>
+            <w:r>
+              <w:t xml:space="preserve"> API, ML models, System architecture.</w:t>
             </w:r>
           </w:p>
         </w:tc>
@@ -149,8 +157,13 @@
           </w:tcPr>
           <w:p>
             <w:r>
-              <w:t>Tisha Rani Chakroborty</w:t>
+              <w:t xml:space="preserve">Tisha Rani </w:t>
             </w:r>
+            <w:proofErr w:type="spellStart"/>
+            <w:r>
+              <w:t>Chakroborty</w:t>
+            </w:r>
+            <w:proofErr w:type="spellEnd"/>
           </w:p>
         </w:tc>
         <w:tc>
@@ -169,7 +182,7 @@
           </w:tcPr>
           <w:p>
             <w:r>
-              <w:t>Frontend Developer. Student dashboard and admin pages using HTML and Tailwind CSS.</w:t>
+              <w:t>Frontend. HTML and Tailwind CSS.</w:t>
             </w:r>
           </w:p>
         </w:tc>
@@ -181,8 +194,13 @@
           </w:tcPr>
           <w:p>
             <w:r>
-              <w:t>Fariha Rahman Oishee</w:t>
+              <w:t xml:space="preserve">Fariha Rahman </w:t>
             </w:r>
+            <w:proofErr w:type="spellStart"/>
+            <w:r>
+              <w:t>Oishee</w:t>
+            </w:r>
+            <w:proofErr w:type="spellEnd"/>
           </w:p>
         </w:tc>
         <w:tc>
@@ -201,7 +219,15 @@
           </w:tcPr>
           <w:p>
             <w:r>
-              <w:t>Database Manager. PostgreSQL tables in Supabase (Student and SkillLog tables).</w:t>
+              <w:t xml:space="preserve">Database Manager. PostgreSQL tables in </w:t>
+            </w:r>
+            <w:proofErr w:type="spellStart"/>
+            <w:r>
+              <w:t>Supabase</w:t>
+            </w:r>
+            <w:proofErr w:type="spellEnd"/>
+            <w:r>
+              <w:t xml:space="preserve"> </w:t>
             </w:r>
           </w:p>
         </w:tc>
@@ -233,7 +259,7 @@
           </w:tcPr>
           <w:p>
             <w:r>
-              <w:t>Backend Support. Payment gateway integration, PDF generator, and API testing.</w:t>
+              <w:t>Backend Support. Payment gateway, and API testing.</w:t>
             </w:r>
           </w:p>
         </w:tc>
@@ -280,16 +306,10 @@
       </w:r>
     </w:p>
     <w:p>
-      <w:r>
-        <w:br w:type="page"/>
-      </w:r>
-    </w:p>
-    <w:p>
       <w:pPr>
         <w:pStyle w:val="Heading1"/>
       </w:pPr>
       <w:r>
-        <w:lastRenderedPageBreak/>
         <w:t>2. Problem Statement</w:t>
       </w:r>
     </w:p>
@@ -327,6 +347,7 @@
         <w:pStyle w:val="ListBullet"/>
       </w:pPr>
       <w:r>
+        <w:lastRenderedPageBreak/>
         <w:t>To automate administrative workflows including admission, payment, and weekly reports.</w:t>
       </w:r>
     </w:p>
@@ -335,7 +356,15 @@
         <w:pStyle w:val="ListBullet"/>
       </w:pPr>
       <w:r>
-        <w:t>To provide a 'Career Readiness Score' based on CGPA and market data (BDJobs/LinkedIn).</w:t>
+        <w:t>To provide a 'Career Readiness Score' based on CGPA and market data (</w:t>
+      </w:r>
+      <w:proofErr w:type="spellStart"/>
+      <w:r>
+        <w:t>BDJobs</w:t>
+      </w:r>
+      <w:proofErr w:type="spellEnd"/>
+      <w:r>
+        <w:t>/LinkedIn).</w:t>
       </w:r>
     </w:p>
     <w:p>
@@ -422,8 +451,13 @@
             <w:tcW w:w="4680" w:type="dxa"/>
           </w:tcPr>
           <w:p>
+            <w:proofErr w:type="spellStart"/>
             <w:r>
-              <w:t>OpenRouter API (Claude 3) provides coding help and career advice with gamified points.</w:t>
+              <w:t>OpenRouter</w:t>
+            </w:r>
+            <w:proofErr w:type="spellEnd"/>
+            <w:r>
+              <w:t xml:space="preserve"> API (Claude 3) provides coding help and career advice with gamified points.</w:t>
             </w:r>
           </w:p>
         </w:tc>
@@ -468,28 +502,6 @@
           <w:p>
             <w:r>
               <w:t>Calculated (0-100) based on CGPA + Skills. Provides feedback for job readiness.</w:t>
-            </w:r>
-          </w:p>
-        </w:tc>
-      </w:tr>
-      <w:tr>
-        <w:tc>
-          <w:tcPr>
-            <w:tcW w:w="4680" w:type="dxa"/>
-          </w:tcPr>
-          <w:p>
-            <w:r>
-              <w:t>Automated Workflow</w:t>
-            </w:r>
-          </w:p>
-        </w:tc>
-        <w:tc>
-          <w:tcPr>
-            <w:tcW w:w="4680" w:type="dxa"/>
-          </w:tcPr>
-          <w:p>
-            <w:r>
-              <w:t>End-to-end automation: Registration &gt; Payment &gt; PDF Receipt &gt; Result Entry.</w:t>
             </w:r>
           </w:p>
         </w:tc>
@@ -604,7 +616,15 @@
           </w:tcPr>
           <w:p>
             <w:r>
-              <w:t>PostgreSQL (Supabase)</w:t>
+              <w:t>PostgreSQL (</w:t>
+            </w:r>
+            <w:proofErr w:type="spellStart"/>
+            <w:r>
+              <w:t>Supabase</w:t>
+            </w:r>
+            <w:proofErr w:type="spellEnd"/>
+            <w:r>
+              <w:t>)</w:t>
             </w:r>
           </w:p>
         </w:tc>
@@ -635,8 +655,13 @@
             <w:tcW w:w="3120" w:type="dxa"/>
           </w:tcPr>
           <w:p>
+            <w:proofErr w:type="spellStart"/>
             <w:r>
-              <w:t>OpenRouter API, Scikit-learn</w:t>
+              <w:t>OpenRouter</w:t>
+            </w:r>
+            <w:proofErr w:type="spellEnd"/>
+            <w:r>
+              <w:t xml:space="preserve"> API, Scikit-learn</w:t>
             </w:r>
           </w:p>
         </w:tc>
@@ -689,7 +714,6 @@
         <w:pStyle w:val="Heading1"/>
       </w:pPr>
       <w:r>
-        <w:lastRenderedPageBreak/>
         <w:t>6. Expected Outcome</w:t>
       </w:r>
     </w:p>
@@ -874,7 +898,7 @@
   <w:abstractNum w:abstractNumId="8" w15:restartNumberingAfterBreak="0">
     <w:nsid w:val="FFFFFF89"/>
     <w:multiLevelType w:val="singleLevel"/>
-    <w:tmpl w:val="29761A62"/>
+    <w:tmpl w:val="D1E28510"/>
     <w:lvl w:ilvl="0">
       <w:start w:val="1"/>
       <w:numFmt w:val="bullet"/>

</xml_diff>

<commit_message>
docs: update Week01 and Week02 text formatting
</commit_message>
<xml_diff>
--- a/documentation/CSE4204-8D-T01_Proposal.docx
+++ b/documentation/CSE4204-8D-T01_Proposal.docx
@@ -19,6 +19,13 @@
           <w:sz w:val="28"/>
         </w:rPr>
         <w:br/>
+      </w:r>
+      <w:r>
+        <w:rPr>
+          <w:b/>
+          <w:sz w:val="26"/>
+          <w:szCs w:val="26"/>
+        </w:rPr>
         <w:t>Course Code: CSE 4204 | Course Title: Mobile Computing Lab</w:t>
       </w:r>
       <w:r>
@@ -40,6 +47,10 @@
     <w:p>
       <w:pPr>
         <w:jc w:val="center"/>
+        <w:rPr>
+          <w:sz w:val="30"/>
+          <w:szCs w:val="30"/>
+        </w:rPr>
       </w:pPr>
       <w:r>
         <w:rPr>
@@ -47,7 +58,38 @@
           <w:sz w:val="32"/>
         </w:rPr>
         <w:br/>
-        <w:t>Project Title: NUBTK_COPILOT - AI-Powered University ERP and Career Architect</w:t>
+      </w:r>
+      <w:r>
+        <w:rPr>
+          <w:b/>
+          <w:sz w:val="29"/>
+          <w:szCs w:val="29"/>
+        </w:rPr>
+        <w:t xml:space="preserve">Project Title: </w:t>
+      </w:r>
+      <w:r>
+        <w:rPr>
+          <w:b/>
+          <w:sz w:val="26"/>
+          <w:szCs w:val="26"/>
+        </w:rPr>
+        <w:t>NUBTK_COPILOT - AI</w:t>
+      </w:r>
+      <w:r>
+        <w:rPr>
+          <w:b/>
+          <w:sz w:val="29"/>
+          <w:szCs w:val="29"/>
+        </w:rPr>
+        <w:t>-Powered University ERP and</w:t>
+      </w:r>
+      <w:r>
+        <w:rPr>
+          <w:b/>
+          <w:sz w:val="30"/>
+          <w:szCs w:val="30"/>
+        </w:rPr>
+        <w:t xml:space="preserve"> Career Architect</w:t>
       </w:r>
     </w:p>
     <w:p>
@@ -347,7 +389,6 @@
         <w:pStyle w:val="ListBullet"/>
       </w:pPr>
       <w:r>
-        <w:lastRenderedPageBreak/>
         <w:t>To automate administrative workflows including admission, payment, and weekly reports.</w:t>
       </w:r>
     </w:p>
@@ -356,6 +397,7 @@
         <w:pStyle w:val="ListBullet"/>
       </w:pPr>
       <w:r>
+        <w:lastRenderedPageBreak/>
         <w:t>To provide a 'Career Readiness Score' based on CGPA and market data (</w:t>
       </w:r>
       <w:proofErr w:type="spellStart"/>
@@ -723,15 +765,26 @@
       </w:r>
     </w:p>
     <w:p>
+      <w:pPr>
+        <w:rPr>
+          <w:lang w:val="en-GB"/>
+        </w:rPr>
+      </w:pPr>
       <w:r>
         <w:rPr>
           <w:b/>
         </w:rPr>
         <w:t xml:space="preserve">GitHub Repository: </w:t>
       </w:r>
-      <w:r>
-        <w:t>https://github.com/bashirnubtk/cse4204-8d-t01-nubtk-copilot</w:t>
-      </w:r>
+      <w:hyperlink r:id="rId6" w:history="1">
+        <w:r>
+          <w:rPr>
+            <w:rStyle w:val="Hyperlink"/>
+            <w:rFonts w:cs="Times New Roman"/>
+          </w:rPr>
+          <w:t>https://github.com/bashirnubtk/cse4204-8d-t01-nubtk-copilot</w:t>
+        </w:r>
+      </w:hyperlink>
     </w:p>
     <w:sectPr>
       <w:pgSz w:w="12240" w:h="15840"/>
@@ -1553,7 +1606,6 @@
   <w:style w:type="character" w:default="1" w:styleId="DefaultParagraphFont">
     <w:name w:val="Default Paragraph Font"/>
     <w:uiPriority w:val="1"/>
-    <w:semiHidden/>
     <w:unhideWhenUsed/>
   </w:style>
   <w:style w:type="table" w:default="1" w:styleId="TableNormal">
@@ -12328,6 +12380,17 @@
         <w:shd w:val="clear" w:color="auto" w:fill="FBCAA2" w:themeFill="accent6" w:themeFillTint="7F"/>
       </w:tcPr>
     </w:tblStylePr>
+  </w:style>
+  <w:style w:type="character" w:styleId="Hyperlink">
+    <w:name w:val="Hyperlink"/>
+    <w:basedOn w:val="DefaultParagraphFont"/>
+    <w:uiPriority w:val="99"/>
+    <w:unhideWhenUsed/>
+    <w:rsid w:val="00F86CF9"/>
+    <w:rPr>
+      <w:color w:val="0000FF" w:themeColor="hyperlink"/>
+      <w:u w:val="single"/>
+    </w:rPr>
   </w:style>
 </w:styles>
 </file>

</xml_diff>

<commit_message>
QA & Security: Cleaned cache files and updated gitignore
</commit_message>
<xml_diff>
--- a/documentation/CSE4204-8D-T01_Proposal.docx
+++ b/documentation/CSE4204-8D-T01_Proposal.docx
@@ -5,55 +5,74 @@
     <w:p>
       <w:pPr>
         <w:jc w:val="center"/>
+        <w:rPr>
+          <w:rFonts w:cs="Times New Roman"/>
+        </w:rPr>
       </w:pPr>
       <w:r>
         <w:rPr>
+          <w:rFonts w:cs="Times New Roman"/>
           <w:b/>
+          <w:color w:val="1F497D" w:themeColor="text2"/>
           <w:sz w:val="28"/>
         </w:rPr>
         <w:t>Project Proposal</w:t>
       </w:r>
       <w:r>
         <w:rPr>
+          <w:rFonts w:cs="Times New Roman"/>
           <w:b/>
           <w:sz w:val="28"/>
         </w:rPr>
         <w:br/>
       </w:r>
+      <w:bookmarkStart w:id="0" w:name="_Hlk231276893"/>
       <w:r>
         <w:rPr>
+          <w:rFonts w:cs="Times New Roman"/>
           <w:b/>
-          <w:sz w:val="26"/>
-          <w:szCs w:val="26"/>
+          <w:szCs w:val="24"/>
         </w:rPr>
-        <w:t>Course Code: CSE 4204 | Course Title: Mobile Computing Lab</w:t>
+        <w:t>COURSE CODE: CSE 4204 | | COURSE TITLE: MOBILE COMPUTING LAB</w:t>
       </w:r>
       <w:r>
         <w:rPr>
+          <w:rFonts w:cs="Times New Roman"/>
+          <w:b/>
+          <w:color w:val="777777"/>
+          <w:sz w:val="20"/>
+        </w:rPr>
+        <w:br/>
+      </w:r>
+      <w:r>
+        <w:rPr>
+          <w:rFonts w:cs="Times New Roman"/>
           <w:b/>
           <w:sz w:val="28"/>
         </w:rPr>
-        <w:br/>
         <w:t>Semester: Fall 202</w:t>
       </w:r>
       <w:r>
         <w:rPr>
+          <w:rFonts w:cs="Times New Roman"/>
           <w:b/>
           <w:sz w:val="28"/>
         </w:rPr>
         <w:t>6</w:t>
       </w:r>
     </w:p>
+    <w:bookmarkEnd w:id="0"/>
     <w:p>
       <w:pPr>
         <w:jc w:val="center"/>
         <w:rPr>
-          <w:sz w:val="30"/>
-          <w:szCs w:val="30"/>
+          <w:rFonts w:cs="Times New Roman"/>
+          <w:sz w:val="22"/>
         </w:rPr>
       </w:pPr>
       <w:r>
         <w:rPr>
+          <w:rFonts w:cs="Times New Roman"/>
           <w:b/>
           <w:sz w:val="32"/>
         </w:rPr>
@@ -61,6 +80,7 @@
       </w:r>
       <w:r>
         <w:rPr>
+          <w:rFonts w:cs="Times New Roman"/>
           <w:b/>
           <w:sz w:val="29"/>
           <w:szCs w:val="29"/>
@@ -69,34 +89,25 @@
       </w:r>
       <w:r>
         <w:rPr>
+          <w:rFonts w:cs="Times New Roman"/>
           <w:b/>
-          <w:sz w:val="26"/>
-          <w:szCs w:val="26"/>
+          <w:color w:val="1F497D" w:themeColor="text2"/>
+          <w:sz w:val="22"/>
         </w:rPr>
-        <w:t>NUBTK_COPILOT - AI</w:t>
-      </w:r>
-      <w:r>
-        <w:rPr>
-          <w:b/>
-          <w:sz w:val="29"/>
-          <w:szCs w:val="29"/>
-        </w:rPr>
-        <w:t>-Powered University ERP and</w:t>
-      </w:r>
-      <w:r>
-        <w:rPr>
-          <w:b/>
-          <w:sz w:val="30"/>
-          <w:szCs w:val="30"/>
-        </w:rPr>
-        <w:t xml:space="preserve"> Career Architect</w:t>
+        <w:t>NUBTK_COPILOT - AI-Powered University ERP and Career Architect</w:t>
       </w:r>
     </w:p>
     <w:p>
       <w:pPr>
         <w:pStyle w:val="Heading1"/>
+        <w:rPr>
+          <w:rFonts w:ascii="Times New Roman" w:hAnsi="Times New Roman" w:cs="Times New Roman"/>
+        </w:rPr>
       </w:pPr>
       <w:r>
+        <w:rPr>
+          <w:rFonts w:ascii="Times New Roman" w:hAnsi="Times New Roman" w:cs="Times New Roman"/>
+        </w:rPr>
         <w:t>1. Team Information</w:t>
       </w:r>
     </w:p>
@@ -117,8 +128,14 @@
             <w:tcW w:w="3120" w:type="dxa"/>
           </w:tcPr>
           <w:p>
+            <w:pPr>
+              <w:rPr>
+                <w:rFonts w:cs="Times New Roman"/>
+              </w:rPr>
+            </w:pPr>
             <w:r>
               <w:rPr>
+                <w:rFonts w:cs="Times New Roman"/>
                 <w:b/>
               </w:rPr>
               <w:t>Name</w:t>
@@ -130,8 +147,14 @@
             <w:tcW w:w="3120" w:type="dxa"/>
           </w:tcPr>
           <w:p>
+            <w:pPr>
+              <w:rPr>
+                <w:rFonts w:cs="Times New Roman"/>
+              </w:rPr>
+            </w:pPr>
             <w:r>
               <w:rPr>
+                <w:rFonts w:cs="Times New Roman"/>
                 <w:b/>
               </w:rPr>
               <w:t>Student ID</w:t>
@@ -143,8 +166,14 @@
             <w:tcW w:w="3120" w:type="dxa"/>
           </w:tcPr>
           <w:p>
+            <w:pPr>
+              <w:rPr>
+                <w:rFonts w:cs="Times New Roman"/>
+              </w:rPr>
+            </w:pPr>
             <w:r>
               <w:rPr>
+                <w:rFonts w:cs="Times New Roman"/>
                 <w:b/>
               </w:rPr>
               <w:t>Role &amp; Responsibility</w:t>
@@ -158,7 +187,15 @@
             <w:tcW w:w="3120" w:type="dxa"/>
           </w:tcPr>
           <w:p>
+            <w:pPr>
+              <w:rPr>
+                <w:rFonts w:cs="Times New Roman"/>
+              </w:rPr>
+            </w:pPr>
             <w:r>
+              <w:rPr>
+                <w:rFonts w:cs="Times New Roman"/>
+              </w:rPr>
               <w:t>Bashir Alam</w:t>
             </w:r>
           </w:p>
@@ -168,7 +205,15 @@
             <w:tcW w:w="3120" w:type="dxa"/>
           </w:tcPr>
           <w:p>
+            <w:pPr>
+              <w:rPr>
+                <w:rFonts w:cs="Times New Roman"/>
+              </w:rPr>
+            </w:pPr>
             <w:r>
+              <w:rPr>
+                <w:rFonts w:cs="Times New Roman"/>
+              </w:rPr>
               <w:t>11220320963</w:t>
             </w:r>
           </w:p>
@@ -178,15 +223,29 @@
             <w:tcW w:w="3120" w:type="dxa"/>
           </w:tcPr>
           <w:p>
+            <w:pPr>
+              <w:rPr>
+                <w:rFonts w:cs="Times New Roman"/>
+              </w:rPr>
+            </w:pPr>
             <w:r>
+              <w:rPr>
+                <w:rFonts w:cs="Times New Roman"/>
+              </w:rPr>
               <w:t xml:space="preserve">Django backend, Celery automation, </w:t>
             </w:r>
             <w:proofErr w:type="spellStart"/>
             <w:r>
+              <w:rPr>
+                <w:rFonts w:cs="Times New Roman"/>
+              </w:rPr>
               <w:t>OpenRouter</w:t>
             </w:r>
             <w:proofErr w:type="spellEnd"/>
             <w:r>
+              <w:rPr>
+                <w:rFonts w:cs="Times New Roman"/>
+              </w:rPr>
               <w:t xml:space="preserve"> API, ML models, System architecture.</w:t>
             </w:r>
           </w:p>
@@ -198,11 +257,22 @@
             <w:tcW w:w="3120" w:type="dxa"/>
           </w:tcPr>
           <w:p>
+            <w:pPr>
+              <w:rPr>
+                <w:rFonts w:cs="Times New Roman"/>
+              </w:rPr>
+            </w:pPr>
             <w:r>
+              <w:rPr>
+                <w:rFonts w:cs="Times New Roman"/>
+              </w:rPr>
               <w:t xml:space="preserve">Tisha Rani </w:t>
             </w:r>
             <w:proofErr w:type="spellStart"/>
             <w:r>
+              <w:rPr>
+                <w:rFonts w:cs="Times New Roman"/>
+              </w:rPr>
               <w:t>Chakroborty</w:t>
             </w:r>
             <w:proofErr w:type="spellEnd"/>
@@ -213,7 +283,15 @@
             <w:tcW w:w="3120" w:type="dxa"/>
           </w:tcPr>
           <w:p>
+            <w:pPr>
+              <w:rPr>
+                <w:rFonts w:cs="Times New Roman"/>
+              </w:rPr>
+            </w:pPr>
             <w:r>
+              <w:rPr>
+                <w:rFonts w:cs="Times New Roman"/>
+              </w:rPr>
               <w:t>11220320954</w:t>
             </w:r>
           </w:p>
@@ -223,7 +301,15 @@
             <w:tcW w:w="3120" w:type="dxa"/>
           </w:tcPr>
           <w:p>
+            <w:pPr>
+              <w:rPr>
+                <w:rFonts w:cs="Times New Roman"/>
+              </w:rPr>
+            </w:pPr>
             <w:r>
+              <w:rPr>
+                <w:rFonts w:cs="Times New Roman"/>
+              </w:rPr>
               <w:t>Frontend. HTML and Tailwind CSS.</w:t>
             </w:r>
           </w:p>
@@ -235,11 +321,22 @@
             <w:tcW w:w="3120" w:type="dxa"/>
           </w:tcPr>
           <w:p>
+            <w:pPr>
+              <w:rPr>
+                <w:rFonts w:cs="Times New Roman"/>
+              </w:rPr>
+            </w:pPr>
             <w:r>
+              <w:rPr>
+                <w:rFonts w:cs="Times New Roman"/>
+              </w:rPr>
               <w:t xml:space="preserve">Fariha Rahman </w:t>
             </w:r>
             <w:proofErr w:type="spellStart"/>
             <w:r>
+              <w:rPr>
+                <w:rFonts w:cs="Times New Roman"/>
+              </w:rPr>
               <w:t>Oishee</w:t>
             </w:r>
             <w:proofErr w:type="spellEnd"/>
@@ -250,7 +347,15 @@
             <w:tcW w:w="3120" w:type="dxa"/>
           </w:tcPr>
           <w:p>
+            <w:pPr>
+              <w:rPr>
+                <w:rFonts w:cs="Times New Roman"/>
+              </w:rPr>
+            </w:pPr>
             <w:r>
+              <w:rPr>
+                <w:rFonts w:cs="Times New Roman"/>
+              </w:rPr>
               <w:t>11220320967</w:t>
             </w:r>
           </w:p>
@@ -260,15 +365,29 @@
             <w:tcW w:w="3120" w:type="dxa"/>
           </w:tcPr>
           <w:p>
+            <w:pPr>
+              <w:rPr>
+                <w:rFonts w:cs="Times New Roman"/>
+              </w:rPr>
+            </w:pPr>
             <w:r>
+              <w:rPr>
+                <w:rFonts w:cs="Times New Roman"/>
+              </w:rPr>
               <w:t xml:space="preserve">Database Manager. PostgreSQL tables in </w:t>
             </w:r>
             <w:proofErr w:type="spellStart"/>
             <w:r>
+              <w:rPr>
+                <w:rFonts w:cs="Times New Roman"/>
+              </w:rPr>
               <w:t>Supabase</w:t>
             </w:r>
             <w:proofErr w:type="spellEnd"/>
             <w:r>
+              <w:rPr>
+                <w:rFonts w:cs="Times New Roman"/>
+              </w:rPr>
               <w:t xml:space="preserve"> </w:t>
             </w:r>
           </w:p>
@@ -280,7 +399,15 @@
             <w:tcW w:w="3120" w:type="dxa"/>
           </w:tcPr>
           <w:p>
+            <w:pPr>
+              <w:rPr>
+                <w:rFonts w:cs="Times New Roman"/>
+              </w:rPr>
+            </w:pPr>
             <w:r>
+              <w:rPr>
+                <w:rFonts w:cs="Times New Roman"/>
+              </w:rPr>
               <w:t>Ratul Raha Shuvo</w:t>
             </w:r>
           </w:p>
@@ -290,7 +417,15 @@
             <w:tcW w:w="3120" w:type="dxa"/>
           </w:tcPr>
           <w:p>
+            <w:pPr>
+              <w:rPr>
+                <w:rFonts w:cs="Times New Roman"/>
+              </w:rPr>
+            </w:pPr>
             <w:r>
+              <w:rPr>
+                <w:rFonts w:cs="Times New Roman"/>
+              </w:rPr>
               <w:t>11220320949</w:t>
             </w:r>
           </w:p>
@@ -300,7 +435,15 @@
             <w:tcW w:w="3120" w:type="dxa"/>
           </w:tcPr>
           <w:p>
+            <w:pPr>
+              <w:rPr>
+                <w:rFonts w:cs="Times New Roman"/>
+              </w:rPr>
+            </w:pPr>
             <w:r>
+              <w:rPr>
+                <w:rFonts w:cs="Times New Roman"/>
+              </w:rPr>
               <w:t>Backend Support. Payment gateway, and API testing.</w:t>
             </w:r>
           </w:p>
@@ -308,112 +451,201 @@
       </w:tr>
     </w:tbl>
     <w:p>
+      <w:pPr>
+        <w:rPr>
+          <w:rFonts w:cs="Times New Roman"/>
+        </w:rPr>
+      </w:pPr>
       <w:r>
         <w:rPr>
+          <w:rFonts w:cs="Times New Roman"/>
           <w:b/>
         </w:rPr>
         <w:br/>
         <w:t xml:space="preserve">Instructor: </w:t>
       </w:r>
       <w:r>
+        <w:rPr>
+          <w:rFonts w:cs="Times New Roman"/>
+        </w:rPr>
         <w:t>Md. Riaz Mahmud, Assistant Professor, Dept of CSE, NUBTK</w:t>
       </w:r>
       <w:r>
         <w:rPr>
+          <w:rFonts w:cs="Times New Roman"/>
           <w:b/>
         </w:rPr>
         <w:br/>
         <w:t xml:space="preserve">Section: </w:t>
       </w:r>
       <w:r>
+        <w:rPr>
+          <w:rFonts w:cs="Times New Roman"/>
+        </w:rPr>
         <w:t>8</w:t>
       </w:r>
       <w:r>
+        <w:rPr>
+          <w:rFonts w:cs="Times New Roman"/>
+        </w:rPr>
         <w:t>D</w:t>
       </w:r>
       <w:r>
         <w:rPr>
+          <w:rFonts w:cs="Times New Roman"/>
           <w:b/>
         </w:rPr>
         <w:t xml:space="preserve"> | Team ID: </w:t>
       </w:r>
       <w:r>
+        <w:rPr>
+          <w:rFonts w:cs="Times New Roman"/>
+        </w:rPr>
         <w:t>CSE4204-8</w:t>
       </w:r>
       <w:r>
+        <w:rPr>
+          <w:rFonts w:cs="Times New Roman"/>
+        </w:rPr>
         <w:t>D</w:t>
       </w:r>
       <w:r>
+        <w:rPr>
+          <w:rFonts w:cs="Times New Roman"/>
+        </w:rPr>
         <w:t>-T01</w:t>
       </w:r>
     </w:p>
     <w:p>
       <w:pPr>
         <w:pStyle w:val="Heading1"/>
+        <w:rPr>
+          <w:rFonts w:ascii="Times New Roman" w:hAnsi="Times New Roman" w:cs="Times New Roman"/>
+        </w:rPr>
       </w:pPr>
       <w:r>
+        <w:rPr>
+          <w:rFonts w:ascii="Times New Roman" w:hAnsi="Times New Roman" w:cs="Times New Roman"/>
+        </w:rPr>
         <w:t>2. Problem Statement</w:t>
       </w:r>
     </w:p>
     <w:p>
+      <w:pPr>
+        <w:spacing w:line="360" w:lineRule="auto"/>
+        <w:jc w:val="both"/>
+        <w:rPr>
+          <w:rFonts w:cs="Times New Roman"/>
+        </w:rPr>
+      </w:pPr>
       <w:r>
+        <w:rPr>
+          <w:rFonts w:cs="Times New Roman"/>
+        </w:rPr>
         <w:t>Current university management systems are limited to administrative data entry like results and attendance. There is no granular tracking of practical skills that students acquire after each semester, such as 'Python Loops' or 'SQL Joins'. As a result, final-year students cannot identify if their skills match job market demands. Additionally, faculty members lack data-driven insights to identify which students are struggling in specific subjects. NUBTK_COPILOT aims to solve this gap by bridging academia and industry requirements.</w:t>
       </w:r>
     </w:p>
     <w:p>
       <w:pPr>
         <w:pStyle w:val="Heading1"/>
+        <w:jc w:val="both"/>
+        <w:rPr>
+          <w:rFonts w:ascii="Times New Roman" w:hAnsi="Times New Roman" w:cs="Times New Roman"/>
+        </w:rPr>
       </w:pPr>
       <w:r>
+        <w:rPr>
+          <w:rFonts w:ascii="Times New Roman" w:hAnsi="Times New Roman" w:cs="Times New Roman"/>
+        </w:rPr>
         <w:t>3. Objectives</w:t>
       </w:r>
     </w:p>
     <w:p>
       <w:pPr>
         <w:pStyle w:val="ListBullet"/>
+        <w:jc w:val="both"/>
+        <w:rPr>
+          <w:rFonts w:cs="Times New Roman"/>
+        </w:rPr>
       </w:pPr>
       <w:r>
+        <w:rPr>
+          <w:rFonts w:cs="Times New Roman"/>
+        </w:rPr>
         <w:t>To develop a smart ERP system that tracks students' academic records along with technical skill inventory.</w:t>
       </w:r>
     </w:p>
     <w:p>
       <w:pPr>
         <w:pStyle w:val="ListBullet"/>
+        <w:jc w:val="both"/>
+        <w:rPr>
+          <w:rFonts w:cs="Times New Roman"/>
+        </w:rPr>
       </w:pPr>
       <w:r>
+        <w:rPr>
+          <w:rFonts w:cs="Times New Roman"/>
+        </w:rPr>
         <w:t>To build an AI Mentor Hub for programming, career guidance, and skill improvement through chat.</w:t>
       </w:r>
     </w:p>
     <w:p>
       <w:pPr>
         <w:pStyle w:val="ListBullet"/>
+        <w:jc w:val="both"/>
+        <w:rPr>
+          <w:rFonts w:cs="Times New Roman"/>
+        </w:rPr>
       </w:pPr>
       <w:r>
+        <w:rPr>
+          <w:rFonts w:cs="Times New Roman"/>
+        </w:rPr>
+        <w:lastRenderedPageBreak/>
         <w:t>To automate administrative workflows including admission, payment, and weekly reports.</w:t>
       </w:r>
     </w:p>
     <w:p>
       <w:pPr>
         <w:pStyle w:val="ListBullet"/>
+        <w:jc w:val="both"/>
+        <w:rPr>
+          <w:rFonts w:cs="Times New Roman"/>
+        </w:rPr>
       </w:pPr>
       <w:r>
-        <w:lastRenderedPageBreak/>
+        <w:rPr>
+          <w:rFonts w:cs="Times New Roman"/>
+        </w:rPr>
         <w:t>To provide a 'Career Readiness Score' based on CGPA and market data (</w:t>
       </w:r>
       <w:proofErr w:type="spellStart"/>
       <w:r>
+        <w:rPr>
+          <w:rFonts w:cs="Times New Roman"/>
+        </w:rPr>
         <w:t>BDJobs</w:t>
       </w:r>
       <w:proofErr w:type="spellEnd"/>
       <w:r>
+        <w:rPr>
+          <w:rFonts w:cs="Times New Roman"/>
+        </w:rPr>
         <w:t>/LinkedIn).</w:t>
       </w:r>
     </w:p>
     <w:p>
       <w:pPr>
         <w:pStyle w:val="Heading1"/>
+        <w:rPr>
+          <w:rFonts w:ascii="Times New Roman" w:hAnsi="Times New Roman" w:cs="Times New Roman"/>
+        </w:rPr>
       </w:pPr>
       <w:r>
+        <w:rPr>
+          <w:rFonts w:ascii="Times New Roman" w:hAnsi="Times New Roman" w:cs="Times New Roman"/>
+        </w:rPr>
         <w:t>4. Proposed Features</w:t>
       </w:r>
     </w:p>
@@ -433,8 +665,14 @@
             <w:tcW w:w="4680" w:type="dxa"/>
           </w:tcPr>
           <w:p>
+            <w:pPr>
+              <w:rPr>
+                <w:rFonts w:cs="Times New Roman"/>
+              </w:rPr>
+            </w:pPr>
             <w:r>
               <w:rPr>
+                <w:rFonts w:cs="Times New Roman"/>
                 <w:b/>
               </w:rPr>
               <w:t>Feature</w:t>
@@ -446,8 +684,14 @@
             <w:tcW w:w="4680" w:type="dxa"/>
           </w:tcPr>
           <w:p>
+            <w:pPr>
+              <w:rPr>
+                <w:rFonts w:cs="Times New Roman"/>
+              </w:rPr>
+            </w:pPr>
             <w:r>
               <w:rPr>
+                <w:rFonts w:cs="Times New Roman"/>
                 <w:b/>
               </w:rPr>
               <w:t>Description</w:t>
@@ -461,7 +705,15 @@
             <w:tcW w:w="4680" w:type="dxa"/>
           </w:tcPr>
           <w:p>
+            <w:pPr>
+              <w:rPr>
+                <w:rFonts w:cs="Times New Roman"/>
+              </w:rPr>
+            </w:pPr>
             <w:r>
+              <w:rPr>
+                <w:rFonts w:cs="Times New Roman"/>
+              </w:rPr>
               <w:t>Skill Inventory Module</w:t>
             </w:r>
           </w:p>
@@ -471,7 +723,15 @@
             <w:tcW w:w="4680" w:type="dxa"/>
           </w:tcPr>
           <w:p>
+            <w:pPr>
+              <w:rPr>
+                <w:rFonts w:cs="Times New Roman"/>
+              </w:rPr>
+            </w:pPr>
             <w:r>
+              <w:rPr>
+                <w:rFonts w:cs="Times New Roman"/>
+              </w:rPr>
               <w:t>Students log skills (e.g., SQL Joins) after courses for future reference.</w:t>
             </w:r>
           </w:p>
@@ -483,7 +743,15 @@
             <w:tcW w:w="4680" w:type="dxa"/>
           </w:tcPr>
           <w:p>
+            <w:pPr>
+              <w:rPr>
+                <w:rFonts w:cs="Times New Roman"/>
+              </w:rPr>
+            </w:pPr>
             <w:r>
+              <w:rPr>
+                <w:rFonts w:cs="Times New Roman"/>
+              </w:rPr>
               <w:t>AI Mentor Hub</w:t>
             </w:r>
           </w:p>
@@ -493,12 +761,23 @@
             <w:tcW w:w="4680" w:type="dxa"/>
           </w:tcPr>
           <w:p>
+            <w:pPr>
+              <w:rPr>
+                <w:rFonts w:cs="Times New Roman"/>
+              </w:rPr>
+            </w:pPr>
             <w:proofErr w:type="spellStart"/>
             <w:r>
+              <w:rPr>
+                <w:rFonts w:cs="Times New Roman"/>
+              </w:rPr>
               <w:t>OpenRouter</w:t>
             </w:r>
             <w:proofErr w:type="spellEnd"/>
             <w:r>
+              <w:rPr>
+                <w:rFonts w:cs="Times New Roman"/>
+              </w:rPr>
               <w:t xml:space="preserve"> API (Claude 3) provides coding help and career advice with gamified points.</w:t>
             </w:r>
           </w:p>
@@ -510,7 +789,15 @@
             <w:tcW w:w="4680" w:type="dxa"/>
           </w:tcPr>
           <w:p>
+            <w:pPr>
+              <w:rPr>
+                <w:rFonts w:cs="Times New Roman"/>
+              </w:rPr>
+            </w:pPr>
             <w:r>
+              <w:rPr>
+                <w:rFonts w:cs="Times New Roman"/>
+              </w:rPr>
               <w:t>Admin Insight Engine</w:t>
             </w:r>
           </w:p>
@@ -520,7 +807,15 @@
             <w:tcW w:w="4680" w:type="dxa"/>
           </w:tcPr>
           <w:p>
+            <w:pPr>
+              <w:rPr>
+                <w:rFonts w:cs="Times New Roman"/>
+              </w:rPr>
+            </w:pPr>
             <w:r>
+              <w:rPr>
+                <w:rFonts w:cs="Times New Roman"/>
+              </w:rPr>
               <w:t>Celery sends automated weekly reports on student performance to admins.</w:t>
             </w:r>
           </w:p>
@@ -532,7 +827,15 @@
             <w:tcW w:w="4680" w:type="dxa"/>
           </w:tcPr>
           <w:p>
+            <w:pPr>
+              <w:rPr>
+                <w:rFonts w:cs="Times New Roman"/>
+              </w:rPr>
+            </w:pPr>
             <w:r>
+              <w:rPr>
+                <w:rFonts w:cs="Times New Roman"/>
+              </w:rPr>
               <w:t>Career Readiness Score</w:t>
             </w:r>
           </w:p>
@@ -542,7 +845,15 @@
             <w:tcW w:w="4680" w:type="dxa"/>
           </w:tcPr>
           <w:p>
+            <w:pPr>
+              <w:rPr>
+                <w:rFonts w:cs="Times New Roman"/>
+              </w:rPr>
+            </w:pPr>
             <w:r>
+              <w:rPr>
+                <w:rFonts w:cs="Times New Roman"/>
+              </w:rPr>
               <w:t>Calculated (0-100) based on CGPA + Skills. Provides feedback for job readiness.</w:t>
             </w:r>
           </w:p>
@@ -552,8 +863,14 @@
     <w:p>
       <w:pPr>
         <w:pStyle w:val="Heading1"/>
+        <w:rPr>
+          <w:rFonts w:ascii="Times New Roman" w:hAnsi="Times New Roman" w:cs="Times New Roman"/>
+        </w:rPr>
       </w:pPr>
       <w:r>
+        <w:rPr>
+          <w:rFonts w:ascii="Times New Roman" w:hAnsi="Times New Roman" w:cs="Times New Roman"/>
+        </w:rPr>
         <w:t>5. Technology Stack</w:t>
       </w:r>
     </w:p>
@@ -574,8 +891,14 @@
             <w:tcW w:w="3120" w:type="dxa"/>
           </w:tcPr>
           <w:p>
+            <w:pPr>
+              <w:rPr>
+                <w:rFonts w:cs="Times New Roman"/>
+              </w:rPr>
+            </w:pPr>
             <w:r>
               <w:rPr>
+                <w:rFonts w:cs="Times New Roman"/>
                 <w:b/>
               </w:rPr>
               <w:t>Component</w:t>
@@ -587,8 +910,14 @@
             <w:tcW w:w="3120" w:type="dxa"/>
           </w:tcPr>
           <w:p>
+            <w:pPr>
+              <w:rPr>
+                <w:rFonts w:cs="Times New Roman"/>
+              </w:rPr>
+            </w:pPr>
             <w:r>
               <w:rPr>
+                <w:rFonts w:cs="Times New Roman"/>
                 <w:b/>
               </w:rPr>
               <w:t>Technology</w:t>
@@ -600,8 +929,14 @@
             <w:tcW w:w="3120" w:type="dxa"/>
           </w:tcPr>
           <w:p>
+            <w:pPr>
+              <w:rPr>
+                <w:rFonts w:cs="Times New Roman"/>
+              </w:rPr>
+            </w:pPr>
             <w:r>
               <w:rPr>
+                <w:rFonts w:cs="Times New Roman"/>
                 <w:b/>
               </w:rPr>
               <w:t>Justification</w:t>
@@ -615,7 +950,15 @@
             <w:tcW w:w="3120" w:type="dxa"/>
           </w:tcPr>
           <w:p>
+            <w:pPr>
+              <w:rPr>
+                <w:rFonts w:cs="Times New Roman"/>
+              </w:rPr>
+            </w:pPr>
             <w:r>
+              <w:rPr>
+                <w:rFonts w:cs="Times New Roman"/>
+              </w:rPr>
               <w:t>Backend</w:t>
             </w:r>
           </w:p>
@@ -625,7 +968,15 @@
             <w:tcW w:w="3120" w:type="dxa"/>
           </w:tcPr>
           <w:p>
+            <w:pPr>
+              <w:rPr>
+                <w:rFonts w:cs="Times New Roman"/>
+              </w:rPr>
+            </w:pPr>
             <w:r>
+              <w:rPr>
+                <w:rFonts w:cs="Times New Roman"/>
+              </w:rPr>
               <w:t>Django 5.0, Python 3.11</w:t>
             </w:r>
           </w:p>
@@ -635,7 +986,15 @@
             <w:tcW w:w="3120" w:type="dxa"/>
           </w:tcPr>
           <w:p>
+            <w:pPr>
+              <w:rPr>
+                <w:rFonts w:cs="Times New Roman"/>
+              </w:rPr>
+            </w:pPr>
             <w:r>
+              <w:rPr>
+                <w:rFonts w:cs="Times New Roman"/>
+              </w:rPr>
               <w:t>Rapid development, high security, and robust API support.</w:t>
             </w:r>
           </w:p>
@@ -647,7 +1006,15 @@
             <w:tcW w:w="3120" w:type="dxa"/>
           </w:tcPr>
           <w:p>
+            <w:pPr>
+              <w:rPr>
+                <w:rFonts w:cs="Times New Roman"/>
+              </w:rPr>
+            </w:pPr>
             <w:r>
+              <w:rPr>
+                <w:rFonts w:cs="Times New Roman"/>
+              </w:rPr>
               <w:t>Database</w:t>
             </w:r>
           </w:p>
@@ -657,15 +1024,29 @@
             <w:tcW w:w="3120" w:type="dxa"/>
           </w:tcPr>
           <w:p>
+            <w:pPr>
+              <w:rPr>
+                <w:rFonts w:cs="Times New Roman"/>
+              </w:rPr>
+            </w:pPr>
             <w:r>
+              <w:rPr>
+                <w:rFonts w:cs="Times New Roman"/>
+              </w:rPr>
               <w:t>PostgreSQL (</w:t>
             </w:r>
             <w:proofErr w:type="spellStart"/>
             <w:r>
+              <w:rPr>
+                <w:rFonts w:cs="Times New Roman"/>
+              </w:rPr>
               <w:t>Supabase</w:t>
             </w:r>
             <w:proofErr w:type="spellEnd"/>
             <w:r>
+              <w:rPr>
+                <w:rFonts w:cs="Times New Roman"/>
+              </w:rPr>
               <w:t>)</w:t>
             </w:r>
           </w:p>
@@ -675,7 +1056,15 @@
             <w:tcW w:w="3120" w:type="dxa"/>
           </w:tcPr>
           <w:p>
+            <w:pPr>
+              <w:rPr>
+                <w:rFonts w:cs="Times New Roman"/>
+              </w:rPr>
+            </w:pPr>
             <w:r>
+              <w:rPr>
+                <w:rFonts w:cs="Times New Roman"/>
+              </w:rPr>
               <w:t>Real-time capabilities and large dataset handling.</w:t>
             </w:r>
           </w:p>
@@ -687,7 +1076,15 @@
             <w:tcW w:w="3120" w:type="dxa"/>
           </w:tcPr>
           <w:p>
+            <w:pPr>
+              <w:rPr>
+                <w:rFonts w:cs="Times New Roman"/>
+              </w:rPr>
+            </w:pPr>
             <w:r>
+              <w:rPr>
+                <w:rFonts w:cs="Times New Roman"/>
+              </w:rPr>
               <w:t>AI/ML</w:t>
             </w:r>
           </w:p>
@@ -697,12 +1094,23 @@
             <w:tcW w:w="3120" w:type="dxa"/>
           </w:tcPr>
           <w:p>
+            <w:pPr>
+              <w:rPr>
+                <w:rFonts w:cs="Times New Roman"/>
+              </w:rPr>
+            </w:pPr>
             <w:proofErr w:type="spellStart"/>
             <w:r>
+              <w:rPr>
+                <w:rFonts w:cs="Times New Roman"/>
+              </w:rPr>
               <w:t>OpenRouter</w:t>
             </w:r>
             <w:proofErr w:type="spellEnd"/>
             <w:r>
+              <w:rPr>
+                <w:rFonts w:cs="Times New Roman"/>
+              </w:rPr>
               <w:t xml:space="preserve"> API, Scikit-learn</w:t>
             </w:r>
           </w:p>
@@ -712,7 +1120,15 @@
             <w:tcW w:w="3120" w:type="dxa"/>
           </w:tcPr>
           <w:p>
+            <w:pPr>
+              <w:rPr>
+                <w:rFonts w:cs="Times New Roman"/>
+              </w:rPr>
+            </w:pPr>
             <w:r>
+              <w:rPr>
+                <w:rFonts w:cs="Times New Roman"/>
+              </w:rPr>
               <w:t>Claude 3 for mentoring, ML for performance prediction.</w:t>
             </w:r>
           </w:p>
@@ -724,7 +1140,15 @@
             <w:tcW w:w="3120" w:type="dxa"/>
           </w:tcPr>
           <w:p>
+            <w:pPr>
+              <w:rPr>
+                <w:rFonts w:cs="Times New Roman"/>
+              </w:rPr>
+            </w:pPr>
             <w:r>
+              <w:rPr>
+                <w:rFonts w:cs="Times New Roman"/>
+              </w:rPr>
               <w:t>Frontend</w:t>
             </w:r>
           </w:p>
@@ -734,7 +1158,15 @@
             <w:tcW w:w="3120" w:type="dxa"/>
           </w:tcPr>
           <w:p>
+            <w:pPr>
+              <w:rPr>
+                <w:rFonts w:cs="Times New Roman"/>
+              </w:rPr>
+            </w:pPr>
             <w:r>
+              <w:rPr>
+                <w:rFonts w:cs="Times New Roman"/>
+              </w:rPr>
               <w:t>HTML, Tailwind CSS</w:t>
             </w:r>
           </w:p>
@@ -744,7 +1176,15 @@
             <w:tcW w:w="3120" w:type="dxa"/>
           </w:tcPr>
           <w:p>
+            <w:pPr>
+              <w:rPr>
+                <w:rFonts w:cs="Times New Roman"/>
+              </w:rPr>
+            </w:pPr>
             <w:r>
+              <w:rPr>
+                <w:rFonts w:cs="Times New Roman"/>
+              </w:rPr>
               <w:t>Lightweight and fully responsive design.</w:t>
             </w:r>
           </w:p>
@@ -754,24 +1194,42 @@
     <w:p>
       <w:pPr>
         <w:pStyle w:val="Heading1"/>
+        <w:rPr>
+          <w:rFonts w:ascii="Times New Roman" w:hAnsi="Times New Roman" w:cs="Times New Roman"/>
+        </w:rPr>
       </w:pPr>
       <w:r>
+        <w:rPr>
+          <w:rFonts w:ascii="Times New Roman" w:hAnsi="Times New Roman" w:cs="Times New Roman"/>
+        </w:rPr>
         <w:t>6. Expected Outcome</w:t>
       </w:r>
     </w:p>
     <w:p>
+      <w:pPr>
+        <w:spacing w:line="360" w:lineRule="auto"/>
+        <w:jc w:val="both"/>
+        <w:rPr>
+          <w:rFonts w:cs="Times New Roman"/>
+        </w:rPr>
+      </w:pPr>
       <w:r>
+        <w:rPr>
+          <w:rFonts w:cs="Times New Roman"/>
+        </w:rPr>
         <w:t>NUBTK will receive a fully automated system where students identify skill gaps through AI mentorship and faculty get proactive notifications. This serves as a portfolio project demonstrating full-stack, AI, and automation expertise.</w:t>
       </w:r>
     </w:p>
     <w:p>
       <w:pPr>
         <w:rPr>
+          <w:rFonts w:cs="Times New Roman"/>
           <w:lang w:val="en-GB"/>
         </w:rPr>
       </w:pPr>
       <w:r>
         <w:rPr>
+          <w:rFonts w:cs="Times New Roman"/>
           <w:b/>
         </w:rPr>
         <w:t xml:space="preserve">GitHub Repository: </w:t>
@@ -1606,6 +2064,7 @@
   <w:style w:type="character" w:default="1" w:styleId="DefaultParagraphFont">
     <w:name w:val="Default Paragraph Font"/>
     <w:uiPriority w:val="1"/>
+    <w:semiHidden/>
     <w:unhideWhenUsed/>
   </w:style>
   <w:style w:type="table" w:default="1" w:styleId="TableNormal">

</xml_diff>